<commit_message>
Cv invullen met gegevens uit het vorige cv
Contact, opleiding (Summa College, Maurick College), stage bij Contronics
Dry Misting, bezorger bij I Love Sushi en sales bij Face to Face zijn
overgenomen. Alleen het startjaar van HuurDirect is nog een invulveld.

Co-Authored-By: Claude Fable 5.1 <noreply@anthropic.com>
Claude-Session: https://claude.ai/code/session_018ykMZ2P3WGh7UyoGvnCSVu
</commit_message>
<xml_diff>
--- a/docs/cv/cv-tim-hendriks.docx
+++ b/docs/cv/cv-tim-hendriks.docx
@@ -119,6 +119,66 @@
                 <w:sz w:val="20"/>
                 <w:szCs w:val="20"/>
               </w:rPr>
+              <w:t xml:space="preserve">Telefoon</w:t>
+            </w:r>
+          </w:p>
+          <w:p>
+            <w:pPr>
+              <w:spacing w:after="60" w:line="264"/>
+            </w:pPr>
+            <w:r>
+              <w:rPr>
+                <w:rFonts w:ascii="Calibri" w:cs="Calibri" w:eastAsia="Calibri" w:hAnsi="Calibri"/>
+                <w:color w:val="D6E2F0"/>
+                <w:sz w:val="20"/>
+                <w:szCs w:val="20"/>
+              </w:rPr>
+              <w:t xml:space="preserve">06 30 26 51 20</w:t>
+            </w:r>
+          </w:p>
+          <w:p>
+            <w:pPr>
+              <w:spacing w:after="20" w:before="100"/>
+            </w:pPr>
+            <w:r>
+              <w:rPr>
+                <w:rFonts w:ascii="Calibri" w:cs="Calibri" w:eastAsia="Calibri" w:hAnsi="Calibri"/>
+                <w:b/>
+                <w:bCs/>
+                <w:color w:val="FFFFFF"/>
+                <w:sz w:val="20"/>
+                <w:szCs w:val="20"/>
+              </w:rPr>
+              <w:t xml:space="preserve">E-mail</w:t>
+            </w:r>
+          </w:p>
+          <w:p>
+            <w:pPr>
+              <w:spacing w:after="60" w:line="264"/>
+            </w:pPr>
+            <w:r>
+              <w:rPr>
+                <w:rFonts w:ascii="Calibri" w:cs="Calibri" w:eastAsia="Calibri" w:hAnsi="Calibri"/>
+                <w:color w:val="D6E2F0"/>
+                <w:sz w:val="20"/>
+                <w:szCs w:val="20"/>
+              </w:rPr>
+              <w:t xml:space="preserve">tim@timos.nl</w:t>
+            </w:r>
+          </w:p>
+          <w:p>
+            <w:pPr>
+              <w:spacing w:after="20" w:before="100"/>
+            </w:pPr>
+            <w:r>
+              <w:rPr>
+                <w:rFonts w:ascii="Calibri" w:cs="Calibri" w:eastAsia="Calibri" w:hAnsi="Calibri"/>
+                <w:b/>
+                <w:bCs/>
+                <w:color w:val="FFFFFF"/>
+                <w:sz w:val="20"/>
+                <w:szCs w:val="20"/>
+              </w:rPr>
               <w:t xml:space="preserve">Woonplaats</w:t>
             </w:r>
           </w:p>
@@ -129,13 +189,11 @@
             <w:r>
               <w:rPr>
                 <w:rFonts w:ascii="Calibri" w:cs="Calibri" w:eastAsia="Calibri" w:hAnsi="Calibri"/>
-                <w:i/>
-                <w:iCs/>
-                <w:color w:val="FFD37A"/>
-                <w:sz w:val="21"/>
-                <w:szCs w:val="21"/>
-              </w:rPr>
-              <w:t xml:space="preserve">[Plaats]</w:t>
+                <w:color w:val="D6E2F0"/>
+                <w:sz w:val="20"/>
+                <w:szCs w:val="20"/>
+              </w:rPr>
+              <w:t xml:space="preserve">’s-Hertogenbosch</w:t>
             </w:r>
           </w:p>
           <w:p>
@@ -151,7 +209,7 @@
                 <w:sz w:val="20"/>
                 <w:szCs w:val="20"/>
               </w:rPr>
-              <w:t xml:space="preserve">Telefoon</w:t>
+              <w:t xml:space="preserve">LinkedIn</w:t>
             </w:r>
           </w:p>
           <w:p>
@@ -161,91 +219,11 @@
             <w:r>
               <w:rPr>
                 <w:rFonts w:ascii="Calibri" w:cs="Calibri" w:eastAsia="Calibri" w:hAnsi="Calibri"/>
-                <w:i/>
-                <w:iCs/>
-                <w:color w:val="FFD37A"/>
-                <w:sz w:val="21"/>
-                <w:szCs w:val="21"/>
-              </w:rPr>
-              <w:t xml:space="preserve">[06-00000000]</w:t>
-            </w:r>
-          </w:p>
-          <w:p>
-            <w:pPr>
-              <w:spacing w:after="20" w:before="100"/>
-            </w:pPr>
-            <w:r>
-              <w:rPr>
-                <w:rFonts w:ascii="Calibri" w:cs="Calibri" w:eastAsia="Calibri" w:hAnsi="Calibri"/>
-                <w:b/>
-                <w:bCs/>
-                <w:color w:val="FFFFFF"/>
-                <w:sz w:val="20"/>
-                <w:szCs w:val="20"/>
-              </w:rPr>
-              <w:t xml:space="preserve">E-mail</w:t>
-            </w:r>
-          </w:p>
-          <w:p>
-            <w:pPr>
-              <w:spacing w:after="60" w:line="264"/>
-            </w:pPr>
-            <w:r>
-              <w:rPr>
-                <w:rFonts w:ascii="Calibri" w:cs="Calibri" w:eastAsia="Calibri" w:hAnsi="Calibri"/>
-                <w:i/>
-                <w:iCs/>
-                <w:color w:val="FFD37A"/>
-                <w:sz w:val="21"/>
-                <w:szCs w:val="21"/>
-              </w:rPr>
-              <w:t xml:space="preserve">[e-mailadres]</w:t>
-            </w:r>
-          </w:p>
-          <w:p>
-            <w:pPr>
-              <w:spacing w:after="20" w:before="100"/>
-            </w:pPr>
-            <w:r>
-              <w:rPr>
-                <w:rFonts w:ascii="Calibri" w:cs="Calibri" w:eastAsia="Calibri" w:hAnsi="Calibri"/>
-                <w:b/>
-                <w:bCs/>
-                <w:color w:val="FFFFFF"/>
-                <w:sz w:val="20"/>
-                <w:szCs w:val="20"/>
-              </w:rPr>
-              <w:t xml:space="preserve">LinkedIn</w:t>
-            </w:r>
-          </w:p>
-          <w:p>
-            <w:pPr>
-              <w:spacing w:after="60" w:line="264"/>
-            </w:pPr>
-            <w:r>
-              <w:rPr>
-                <w:rFonts w:ascii="Calibri" w:cs="Calibri" w:eastAsia="Calibri" w:hAnsi="Calibri"/>
-                <w:color w:val="D6E2F0"/>
-                <w:sz w:val="20"/>
-                <w:szCs w:val="20"/>
-              </w:rPr>
-              <w:t xml:space="preserve">linkedin.com/in/</w:t>
-            </w:r>
-          </w:p>
-          <w:p>
-            <w:pPr>
-              <w:spacing w:after="60" w:line="264"/>
-            </w:pPr>
-            <w:r>
-              <w:rPr>
-                <w:rFonts w:ascii="Calibri" w:cs="Calibri" w:eastAsia="Calibri" w:hAnsi="Calibri"/>
-                <w:i/>
-                <w:iCs/>
-                <w:color w:val="FFD37A"/>
-                <w:sz w:val="21"/>
-                <w:szCs w:val="21"/>
-              </w:rPr>
-              <w:t xml:space="preserve">[profielnaam]</w:t>
+                <w:color w:val="D6E2F0"/>
+                <w:sz w:val="20"/>
+                <w:szCs w:val="20"/>
+              </w:rPr>
+              <w:t xml:space="preserve">linkedin.com/in/tim-hendriks-98905b328</w:t>
             </w:r>
           </w:p>
           <w:p>
@@ -314,7 +292,7 @@
                 <w:sz w:val="20"/>
                 <w:szCs w:val="20"/>
               </w:rPr>
-              <w:t xml:space="preserve">Ondernemerschap en bedrijfsvoering</w:t>
+              <w:t xml:space="preserve">Ondernemerschap</w:t>
             </w:r>
           </w:p>
           <w:p>
@@ -333,7 +311,7 @@
                 <w:sz w:val="20"/>
                 <w:szCs w:val="20"/>
               </w:rPr>
-              <w:t xml:space="preserve">Klantgericht werken en verkoop</w:t>
+              <w:t xml:space="preserve">Verkoop en klantcontact</w:t>
             </w:r>
           </w:p>
           <w:p>
@@ -352,7 +330,7 @@
                 <w:sz w:val="20"/>
                 <w:szCs w:val="20"/>
               </w:rPr>
-              <w:t xml:space="preserve">Online marketing, SEO en conversie</w:t>
+              <w:t xml:space="preserve">Communicatie en public relations</w:t>
             </w:r>
           </w:p>
           <w:p>
@@ -371,7 +349,7 @@
                 <w:sz w:val="20"/>
                 <w:szCs w:val="20"/>
               </w:rPr>
-              <w:t xml:space="preserve">Websitebeheer en webshopinrichting</w:t>
+              <w:t xml:space="preserve">Leiderschap en samenwerken</w:t>
             </w:r>
           </w:p>
           <w:p>
@@ -390,7 +368,7 @@
                 <w:sz w:val="20"/>
                 <w:szCs w:val="20"/>
               </w:rPr>
-              <w:t xml:space="preserve">Procesoptimalisatie en automatisering</w:t>
+              <w:t xml:space="preserve">Online marketing en webshopbeheer</w:t>
             </w:r>
           </w:p>
           <w:p>
@@ -409,7 +387,7 @@
                 <w:sz w:val="20"/>
                 <w:szCs w:val="20"/>
               </w:rPr>
-              <w:t xml:space="preserve">Werken met AI-tools</w:t>
+              <w:t xml:space="preserve">Timemanagement en planning</w:t>
             </w:r>
           </w:p>
           <w:p>
@@ -428,7 +406,7 @@
                 <w:sz w:val="20"/>
                 <w:szCs w:val="20"/>
               </w:rPr>
-              <w:t xml:space="preserve">Plannen, organiseren en zelfstandig werken</w:t>
+              <w:t xml:space="preserve">Kritisch denken en zelfvertrouwen</w:t>
             </w:r>
           </w:p>
           <w:p>
@@ -504,13 +482,41 @@
             <w:r>
               <w:rPr>
                 <w:rFonts w:ascii="Calibri" w:cs="Calibri" w:eastAsia="Calibri" w:hAnsi="Calibri"/>
-                <w:i/>
-                <w:iCs/>
-                <w:color w:val="FFD37A"/>
-                <w:sz w:val="21"/>
-                <w:szCs w:val="21"/>
-              </w:rPr>
-              <w:t xml:space="preserve">[Goed / vloeiend]</w:t>
+                <w:color w:val="D6E2F0"/>
+                <w:sz w:val="20"/>
+                <w:szCs w:val="20"/>
+              </w:rPr>
+              <w:t xml:space="preserve">Vloeiend</w:t>
+            </w:r>
+          </w:p>
+          <w:p>
+            <w:pPr>
+              <w:spacing w:after="20" w:before="100"/>
+            </w:pPr>
+            <w:r>
+              <w:rPr>
+                <w:rFonts w:ascii="Calibri" w:cs="Calibri" w:eastAsia="Calibri" w:hAnsi="Calibri"/>
+                <w:b/>
+                <w:bCs/>
+                <w:color w:val="FFFFFF"/>
+                <w:sz w:val="20"/>
+                <w:szCs w:val="20"/>
+              </w:rPr>
+              <w:t xml:space="preserve">Spaans</w:t>
+            </w:r>
+          </w:p>
+          <w:p>
+            <w:pPr>
+              <w:spacing w:after="60" w:line="264"/>
+            </w:pPr>
+            <w:r>
+              <w:rPr>
+                <w:rFonts w:ascii="Calibri" w:cs="Calibri" w:eastAsia="Calibri" w:hAnsi="Calibri"/>
+                <w:color w:val="D6E2F0"/>
+                <w:sz w:val="20"/>
+                <w:szCs w:val="20"/>
+              </w:rPr>
+              <w:t xml:space="preserve">Basis</w:t>
             </w:r>
           </w:p>
           <w:p>
@@ -530,7 +536,7 @@
                 <w:sz w:val="21"/>
                 <w:szCs w:val="21"/>
               </w:rPr>
-              <w:t xml:space="preserve">OVERIG</w:t>
+              <w:t xml:space="preserve">OPLEIDING</w:t>
             </w:r>
           </w:p>
           <w:p>
@@ -546,7 +552,7 @@
                 <w:sz w:val="20"/>
                 <w:szCs w:val="20"/>
               </w:rPr>
-              <w:t xml:space="preserve">Rijbewijs</w:t>
+              <w:t xml:space="preserve">MBO 4 International Business</w:t>
             </w:r>
           </w:p>
           <w:p>
@@ -556,13 +562,39 @@
             <w:r>
               <w:rPr>
                 <w:rFonts w:ascii="Calibri" w:cs="Calibri" w:eastAsia="Calibri" w:hAnsi="Calibri"/>
-                <w:i/>
-                <w:iCs/>
-                <w:color w:val="FFD37A"/>
-                <w:sz w:val="21"/>
-                <w:szCs w:val="21"/>
-              </w:rPr>
-              <w:t xml:space="preserve">[B]</w:t>
+                <w:color w:val="D6E2F0"/>
+                <w:sz w:val="20"/>
+                <w:szCs w:val="20"/>
+              </w:rPr>
+              <w:t xml:space="preserve">Summa College, Eindhoven</w:t>
+            </w:r>
+          </w:p>
+          <w:p>
+            <w:pPr>
+              <w:spacing w:after="60" w:line="264"/>
+            </w:pPr>
+            <w:r>
+              <w:rPr>
+                <w:rFonts w:ascii="Calibri" w:cs="Calibri" w:eastAsia="Calibri" w:hAnsi="Calibri"/>
+                <w:color w:val="D6E2F0"/>
+                <w:sz w:val="20"/>
+                <w:szCs w:val="20"/>
+              </w:rPr>
+              <w:t xml:space="preserve">2024 – heden</w:t>
+            </w:r>
+          </w:p>
+          <w:p>
+            <w:pPr>
+              <w:spacing w:after="60" w:line="264"/>
+            </w:pPr>
+            <w:r>
+              <w:rPr>
+                <w:rFonts w:ascii="Calibri" w:cs="Calibri" w:eastAsia="Calibri" w:hAnsi="Calibri"/>
+                <w:color w:val="D6E2F0"/>
+                <w:sz w:val="20"/>
+                <w:szCs w:val="20"/>
+              </w:rPr>
+              <w:t xml:space="preserve">Vakken: Spaans, marketing, export, sales</w:t>
             </w:r>
           </w:p>
           <w:p>
@@ -578,7 +610,7 @@
                 <w:sz w:val="20"/>
                 <w:szCs w:val="20"/>
               </w:rPr>
-              <w:t xml:space="preserve">Geboortedatum</w:t>
+              <w:t xml:space="preserve">HAVO</w:t>
             </w:r>
           </w:p>
           <w:p>
@@ -588,29 +620,11 @@
             <w:r>
               <w:rPr>
                 <w:rFonts w:ascii="Calibri" w:cs="Calibri" w:eastAsia="Calibri" w:hAnsi="Calibri"/>
-                <w:i/>
-                <w:iCs/>
-                <w:color w:val="FFD37A"/>
-                <w:sz w:val="21"/>
-                <w:szCs w:val="21"/>
-              </w:rPr>
-              <w:t xml:space="preserve">[dd-mm-jjjj]</w:t>
-            </w:r>
-          </w:p>
-          <w:p>
-            <w:pPr>
-              <w:spacing w:after="20" w:before="100"/>
-            </w:pPr>
-            <w:r>
-              <w:rPr>
-                <w:rFonts w:ascii="Calibri" w:cs="Calibri" w:eastAsia="Calibri" w:hAnsi="Calibri"/>
-                <w:b/>
-                <w:bCs/>
-                <w:color w:val="FFFFFF"/>
-                <w:sz w:val="20"/>
-                <w:szCs w:val="20"/>
-              </w:rPr>
-              <w:t xml:space="preserve">Interesses</w:t>
+                <w:color w:val="D6E2F0"/>
+                <w:sz w:val="20"/>
+                <w:szCs w:val="20"/>
+              </w:rPr>
+              <w:t xml:space="preserve">Maurick College, Vught</w:t>
             </w:r>
           </w:p>
           <w:p>
@@ -624,7 +638,21 @@
                 <w:sz w:val="20"/>
                 <w:szCs w:val="20"/>
               </w:rPr>
-              <w:t xml:space="preserve">Ondernemen, techniek en innovatie, beleggen, sport</w:t>
+              <w:t xml:space="preserve">2018 – 2024</w:t>
+            </w:r>
+          </w:p>
+          <w:p>
+            <w:pPr>
+              <w:spacing w:after="60" w:line="264"/>
+            </w:pPr>
+            <w:r>
+              <w:rPr>
+                <w:rFonts w:ascii="Calibri" w:cs="Calibri" w:eastAsia="Calibri" w:hAnsi="Calibri"/>
+                <w:color w:val="D6E2F0"/>
+                <w:sz w:val="20"/>
+                <w:szCs w:val="20"/>
+              </w:rPr>
+              <w:t xml:space="preserve">Vakken: Nederlands, Engels, economie, scheikunde, natuurkunde, biologie, wiskunde</w:t>
             </w:r>
           </w:p>
         </w:tc>
@@ -673,10 +701,10 @@
               <w:rPr>
                 <w:rFonts w:ascii="Calibri" w:cs="Calibri" w:eastAsia="Calibri" w:hAnsi="Calibri"/>
                 <w:color w:val="595959"/>
-                <w:sz w:val="25"/>
-                <w:szCs w:val="25"/>
-              </w:rPr>
-              <w:t xml:space="preserve">Ondernemer  ·  Oprichter en eigenaar van HuurDirect</w:t>
+                <w:sz w:val="24"/>
+                <w:szCs w:val="24"/>
+              </w:rPr>
+              <w:t xml:space="preserve">Ondernemer  ·  Oprichter HuurDirect  ·  Student International Business</w:t>
             </w:r>
           </w:p>
           <w:p>
@@ -710,7 +738,7 @@
                 <w:sz w:val="21"/>
                 <w:szCs w:val="21"/>
               </w:rPr>
-              <w:t xml:space="preserve">Jonge, gedreven ondernemer en oprichter van HuurDirect, een online verhuurplatform voor professioneel gereedschap, machines en materieel. Ik heb het platform vanaf nul opgebouwd en ben verantwoordelijk voor het complete plaatje: van propositie, merk en website tot het verhuurproces, de klantenservice en de administratie. Ik werk gestructureerd, stel hoge eisen aan kwaliteit en vind niets “goed genoeg” zolang het aantoonbaar beter kan. Ik leer snel, pak nieuwe technologie praktisch op en zet automatisering en AI-tools in om slimmer te werken.</w:t>
+              <w:t xml:space="preserve">Ondernemende student International Business en oprichter van HuurDirect, een online verhuurplatform voor professioneel gereedschap, machines en materieel. Ik heb het platform vanaf nul opgebouwd en ben verantwoordelijk voor het complete plaatje: van propositie, merk en website tot het verhuurproces en de klantenservice. Daarnaast heb ik ervaring in sales, klantenservice en logistiek, waardoor ik snel schakel tussen verschillende rollen. Ik werk gestructureerd, stel hoge eisen aan kwaliteit en zet automatisering en AI-tools in om slimmer te werken.</w:t>
             </w:r>
           </w:p>
           <w:p>
@@ -788,18 +816,7 @@
                 <w:sz w:val="20"/>
                 <w:szCs w:val="20"/>
               </w:rPr>
-              <w:t xml:space="preserve">Online verhuurplatform voor gereedschap, machines en materieel  ·  </w:t>
-            </w:r>
-            <w:r>
-              <w:rPr>
-                <w:rFonts w:ascii="Calibri" w:cs="Calibri" w:eastAsia="Calibri" w:hAnsi="Calibri"/>
-                <w:i/>
-                <w:iCs/>
-                <w:color w:val="C00000"/>
-                <w:sz w:val="21"/>
-                <w:szCs w:val="21"/>
-              </w:rPr>
-              <w:t xml:space="preserve">[Plaats]</w:t>
+              <w:t xml:space="preserve">Online verhuurplatform voor gereedschap, machines en materieel  ·  ’s-Hertogenbosch</w:t>
             </w:r>
           </w:p>
           <w:p>
@@ -895,25 +912,6 @@
                 <w:szCs w:val="21"/>
               </w:rPr>
               <w:t xml:space="preserve">Beheerpaneel en automatisering ingericht zodat het bedrijf zonder extra handwerk kan opschalen.</w:t>
-            </w:r>
-          </w:p>
-          <w:p>
-            <w:pPr>
-              <w:pStyle w:val="ListParagraph"/>
-              <w:numPr>
-                <w:ilvl w:val="0"/>
-                <w:numId w:val="3"/>
-              </w:numPr>
-              <w:spacing w:after="50" w:line="264"/>
-            </w:pPr>
-            <w:r>
-              <w:rPr>
-                <w:rFonts w:ascii="Calibri" w:cs="Calibri" w:eastAsia="Calibri" w:hAnsi="Calibri"/>
-                <w:color w:val="262626"/>
-                <w:sz w:val="21"/>
-                <w:szCs w:val="21"/>
-              </w:rPr>
-              <w:t xml:space="preserve">Beveiliging en betrouwbaarheid van het platform naar een professioneel niveau gebracht.</w:t>
             </w:r>
           </w:p>
           <w:p>
@@ -926,35 +924,13 @@
             <w:r>
               <w:rPr>
                 <w:rFonts w:ascii="Calibri" w:cs="Calibri" w:eastAsia="Calibri" w:hAnsi="Calibri"/>
-                <w:i/>
-                <w:iCs/>
-                <w:color w:val="C00000"/>
-                <w:sz w:val="21"/>
-                <w:szCs w:val="21"/>
-              </w:rPr>
-              <w:t xml:space="preserve">[Functietitel]</w:t>
-            </w:r>
-            <w:r>
-              <w:rPr>
-                <w:rFonts w:ascii="Calibri" w:cs="Calibri" w:eastAsia="Calibri" w:hAnsi="Calibri"/>
                 <w:b/>
                 <w:bCs/>
                 <w:color w:val="262626"/>
                 <w:sz w:val="22"/>
                 <w:szCs w:val="22"/>
               </w:rPr>
-              <w:t xml:space="preserve"> — </w:t>
-            </w:r>
-            <w:r>
-              <w:rPr>
-                <w:rFonts w:ascii="Calibri" w:cs="Calibri" w:eastAsia="Calibri" w:hAnsi="Calibri"/>
-                <w:i/>
-                <w:iCs/>
-                <w:color w:val="C00000"/>
-                <w:sz w:val="21"/>
-                <w:szCs w:val="21"/>
-              </w:rPr>
-              <w:t xml:space="preserve">[Bedrijf]</w:t>
+              <w:t xml:space="preserve">Stagiair — Contronics Dry Misting</w:t>
             </w:r>
             <w:r>
               <w:tab/>
@@ -962,50 +938,17 @@
             <w:r>
               <w:rPr>
                 <w:rFonts w:ascii="Calibri" w:cs="Calibri" w:eastAsia="Calibri" w:hAnsi="Calibri"/>
-                <w:i/>
-                <w:iCs/>
-                <w:color w:val="C00000"/>
-                <w:sz w:val="21"/>
-                <w:szCs w:val="21"/>
-              </w:rPr>
-              <w:t xml:space="preserve">[jaar]</w:t>
-            </w:r>
-            <w:r>
-              <w:rPr>
-                <w:rFonts w:ascii="Calibri" w:cs="Calibri" w:eastAsia="Calibri" w:hAnsi="Calibri"/>
                 <w:color w:val="595959"/>
                 <w:sz w:val="20"/>
                 <w:szCs w:val="20"/>
               </w:rPr>
-              <w:t xml:space="preserve"> – </w:t>
-            </w:r>
-            <w:r>
-              <w:rPr>
-                <w:rFonts w:ascii="Calibri" w:cs="Calibri" w:eastAsia="Calibri" w:hAnsi="Calibri"/>
-                <w:i/>
-                <w:iCs/>
-                <w:color w:val="C00000"/>
-                <w:sz w:val="21"/>
-                <w:szCs w:val="21"/>
-              </w:rPr>
-              <w:t xml:space="preserve">[jaar]</w:t>
+              <w:t xml:space="preserve">sep 2024 – dec 2025</w:t>
             </w:r>
           </w:p>
           <w:p>
             <w:pPr>
               <w:spacing w:after="60"/>
             </w:pPr>
-            <w:r>
-              <w:rPr>
-                <w:rFonts w:ascii="Calibri" w:cs="Calibri" w:eastAsia="Calibri" w:hAnsi="Calibri"/>
-                <w:i/>
-                <w:iCs/>
-                <w:color w:val="C00000"/>
-                <w:sz w:val="21"/>
-                <w:szCs w:val="21"/>
-              </w:rPr>
-              <w:t xml:space="preserve">[Plaats]</w:t>
-            </w:r>
             <w:r>
               <w:rPr>
                 <w:rFonts w:ascii="Calibri" w:cs="Calibri" w:eastAsia="Calibri" w:hAnsi="Calibri"/>
@@ -1015,18 +958,7 @@
                 <w:sz w:val="20"/>
                 <w:szCs w:val="20"/>
               </w:rPr>
-              <w:t xml:space="preserve">  ·  </w:t>
-            </w:r>
-            <w:r>
-              <w:rPr>
-                <w:rFonts w:ascii="Calibri" w:cs="Calibri" w:eastAsia="Calibri" w:hAnsi="Calibri"/>
-                <w:i/>
-                <w:iCs/>
-                <w:color w:val="C00000"/>
-                <w:sz w:val="21"/>
-                <w:szCs w:val="21"/>
-              </w:rPr>
-              <w:t xml:space="preserve">[korte omschrijving van het bedrijf]</w:t>
+              <w:t xml:space="preserve">Innovatieve en duurzame vernevelingstechniek  ·  stage vanuit de opleiding International Business</w:t>
             </w:r>
           </w:p>
           <w:p>
@@ -1041,13 +973,11 @@
             <w:r>
               <w:rPr>
                 <w:rFonts w:ascii="Calibri" w:cs="Calibri" w:eastAsia="Calibri" w:hAnsi="Calibri"/>
-                <w:i/>
-                <w:iCs/>
-                <w:color w:val="C00000"/>
-                <w:sz w:val="21"/>
-                <w:szCs w:val="21"/>
-              </w:rPr>
-              <w:t xml:space="preserve">[Belangrijkste taak of verantwoordelijkheid]</w:t>
+                <w:color w:val="262626"/>
+                <w:sz w:val="21"/>
+                <w:szCs w:val="21"/>
+              </w:rPr>
+              <w:t xml:space="preserve">Breed meegedraaid in het bedrijf: dossiers en administratie op orde gebracht en meegedacht over nieuwe ideeën.</w:t>
             </w:r>
           </w:p>
           <w:p>
@@ -1062,13 +992,11 @@
             <w:r>
               <w:rPr>
                 <w:rFonts w:ascii="Calibri" w:cs="Calibri" w:eastAsia="Calibri" w:hAnsi="Calibri"/>
-                <w:i/>
-                <w:iCs/>
-                <w:color w:val="C00000"/>
-                <w:sz w:val="21"/>
-                <w:szCs w:val="21"/>
-              </w:rPr>
-              <w:t xml:space="preserve">[Concreet resultaat, het liefst met cijfers]</w:t>
+                <w:color w:val="262626"/>
+                <w:sz w:val="21"/>
+                <w:szCs w:val="21"/>
+              </w:rPr>
+              <w:t xml:space="preserve">Het team geholpen met de voorbereiding van een grote vakbeurs en zo bijgedragen aan de zichtbaarheid van het bedrijf op de beurs.</w:t>
             </w:r>
           </w:p>
           <w:p>
@@ -1081,35 +1009,13 @@
             <w:r>
               <w:rPr>
                 <w:rFonts w:ascii="Calibri" w:cs="Calibri" w:eastAsia="Calibri" w:hAnsi="Calibri"/>
-                <w:i/>
-                <w:iCs/>
-                <w:color w:val="C00000"/>
-                <w:sz w:val="21"/>
-                <w:szCs w:val="21"/>
-              </w:rPr>
-              <w:t xml:space="preserve">[Functietitel]</w:t>
-            </w:r>
-            <w:r>
-              <w:rPr>
-                <w:rFonts w:ascii="Calibri" w:cs="Calibri" w:eastAsia="Calibri" w:hAnsi="Calibri"/>
                 <w:b/>
                 <w:bCs/>
                 <w:color w:val="262626"/>
                 <w:sz w:val="22"/>
                 <w:szCs w:val="22"/>
               </w:rPr>
-              <w:t xml:space="preserve"> — </w:t>
-            </w:r>
-            <w:r>
-              <w:rPr>
-                <w:rFonts w:ascii="Calibri" w:cs="Calibri" w:eastAsia="Calibri" w:hAnsi="Calibri"/>
-                <w:i/>
-                <w:iCs/>
-                <w:color w:val="C00000"/>
-                <w:sz w:val="21"/>
-                <w:szCs w:val="21"/>
-              </w:rPr>
-              <w:t xml:space="preserve">[Bedrijf]</w:t>
+              <w:t xml:space="preserve">Bezorger — I Love Sushi</w:t>
             </w:r>
             <w:r>
               <w:tab/>
@@ -1117,50 +1023,17 @@
             <w:r>
               <w:rPr>
                 <w:rFonts w:ascii="Calibri" w:cs="Calibri" w:eastAsia="Calibri" w:hAnsi="Calibri"/>
-                <w:i/>
-                <w:iCs/>
-                <w:color w:val="C00000"/>
-                <w:sz w:val="21"/>
-                <w:szCs w:val="21"/>
-              </w:rPr>
-              <w:t xml:space="preserve">[jaar]</w:t>
-            </w:r>
-            <w:r>
-              <w:rPr>
-                <w:rFonts w:ascii="Calibri" w:cs="Calibri" w:eastAsia="Calibri" w:hAnsi="Calibri"/>
                 <w:color w:val="595959"/>
                 <w:sz w:val="20"/>
                 <w:szCs w:val="20"/>
               </w:rPr>
-              <w:t xml:space="preserve"> – </w:t>
-            </w:r>
-            <w:r>
-              <w:rPr>
-                <w:rFonts w:ascii="Calibri" w:cs="Calibri" w:eastAsia="Calibri" w:hAnsi="Calibri"/>
-                <w:i/>
-                <w:iCs/>
-                <w:color w:val="C00000"/>
-                <w:sz w:val="21"/>
-                <w:szCs w:val="21"/>
-              </w:rPr>
-              <w:t xml:space="preserve">[jaar]</w:t>
+              <w:t xml:space="preserve">sep 2022 – heden</w:t>
             </w:r>
           </w:p>
           <w:p>
             <w:pPr>
               <w:spacing w:after="60"/>
             </w:pPr>
-            <w:r>
-              <w:rPr>
-                <w:rFonts w:ascii="Calibri" w:cs="Calibri" w:eastAsia="Calibri" w:hAnsi="Calibri"/>
-                <w:i/>
-                <w:iCs/>
-                <w:color w:val="C00000"/>
-                <w:sz w:val="21"/>
-                <w:szCs w:val="21"/>
-              </w:rPr>
-              <w:t xml:space="preserve">[Plaats]</w:t>
-            </w:r>
             <w:r>
               <w:rPr>
                 <w:rFonts w:ascii="Calibri" w:cs="Calibri" w:eastAsia="Calibri" w:hAnsi="Calibri"/>
@@ -1170,18 +1043,111 @@
                 <w:sz w:val="20"/>
                 <w:szCs w:val="20"/>
               </w:rPr>
-              <w:t xml:space="preserve">  ·  </w:t>
-            </w:r>
+              <w:t xml:space="preserve">’s-Hertogenbosch</w:t>
+            </w:r>
+          </w:p>
+          <w:p>
+            <w:pPr>
+              <w:pStyle w:val="ListParagraph"/>
+              <w:numPr>
+                <w:ilvl w:val="0"/>
+                <w:numId w:val="3"/>
+              </w:numPr>
+              <w:spacing w:after="50" w:line="264"/>
+            </w:pPr>
+            <w:r>
+              <w:rPr>
+                <w:rFonts w:ascii="Calibri" w:cs="Calibri" w:eastAsia="Calibri" w:hAnsi="Calibri"/>
+                <w:color w:val="262626"/>
+                <w:sz w:val="21"/>
+                <w:szCs w:val="21"/>
+              </w:rPr>
+              <w:t xml:space="preserve">Bestellingen efficiënt en op tijd bezorgd bij klanten in en rond ’s-Hertogenbosch.</w:t>
+            </w:r>
+          </w:p>
+          <w:p>
+            <w:pPr>
+              <w:pStyle w:val="ListParagraph"/>
+              <w:numPr>
+                <w:ilvl w:val="0"/>
+                <w:numId w:val="3"/>
+              </w:numPr>
+              <w:spacing w:after="50" w:line="264"/>
+            </w:pPr>
+            <w:r>
+              <w:rPr>
+                <w:rFonts w:ascii="Calibri" w:cs="Calibri" w:eastAsia="Calibri" w:hAnsi="Calibri"/>
+                <w:color w:val="262626"/>
+                <w:sz w:val="21"/>
+                <w:szCs w:val="21"/>
+              </w:rPr>
+              <w:t xml:space="preserve">Hoge klanttevredenheid door bestellingen correct en in goede staat af te leveren.</w:t>
+            </w:r>
+          </w:p>
+          <w:p>
+            <w:pPr>
+              <w:pStyle w:val="ListParagraph"/>
+              <w:numPr>
+                <w:ilvl w:val="0"/>
+                <w:numId w:val="3"/>
+              </w:numPr>
+              <w:spacing w:after="50" w:line="264"/>
+            </w:pPr>
+            <w:r>
+              <w:rPr>
+                <w:rFonts w:ascii="Calibri" w:cs="Calibri" w:eastAsia="Calibri" w:hAnsi="Calibri"/>
+                <w:color w:val="262626"/>
+                <w:sz w:val="21"/>
+                <w:szCs w:val="21"/>
+              </w:rPr>
+              <w:t xml:space="preserve">Routes zelf gepland om de bezorgtijd te verkorten en meer ritten per dienst te halen.</w:t>
+            </w:r>
+          </w:p>
+          <w:p>
+            <w:pPr>
+              <w:tabs>
+                <w:tab w:val="right" w:pos="6666"/>
+              </w:tabs>
+              <w:spacing w:after="20" w:before="180"/>
+            </w:pPr>
+            <w:r>
+              <w:rPr>
+                <w:rFonts w:ascii="Calibri" w:cs="Calibri" w:eastAsia="Calibri" w:hAnsi="Calibri"/>
+                <w:b/>
+                <w:bCs/>
+                <w:color w:val="262626"/>
+                <w:sz w:val="22"/>
+                <w:szCs w:val="22"/>
+              </w:rPr>
+              <w:t xml:space="preserve">Sales Representative — Face to Face</w:t>
+            </w:r>
+            <w:r>
+              <w:tab/>
+            </w:r>
+            <w:r>
+              <w:rPr>
+                <w:rFonts w:ascii="Calibri" w:cs="Calibri" w:eastAsia="Calibri" w:hAnsi="Calibri"/>
+                <w:color w:val="595959"/>
+                <w:sz w:val="20"/>
+                <w:szCs w:val="20"/>
+              </w:rPr>
+              <w:t xml:space="preserve">jul 2021 – aug 2022</w:t>
+            </w:r>
+          </w:p>
+          <w:p>
+            <w:pPr>
+              <w:spacing w:after="60"/>
+            </w:pPr>
             <w:r>
               <w:rPr>
                 <w:rFonts w:ascii="Calibri" w:cs="Calibri" w:eastAsia="Calibri" w:hAnsi="Calibri"/>
                 <w:i/>
                 <w:iCs/>
-                <w:color w:val="C00000"/>
-                <w:sz w:val="21"/>
-                <w:szCs w:val="21"/>
-              </w:rPr>
-              <w:t xml:space="preserve">[korte omschrijving van het bedrijf]</w:t>
+                <w:color w:val="595959"/>
+                <w:sz w:val="20"/>
+                <w:szCs w:val="20"/>
+              </w:rPr>
+              <w:t xml:space="preserve">’s-Hertogenbosch</w:t>
             </w:r>
           </w:p>
           <w:p>
@@ -1196,13 +1162,49 @@
             <w:r>
               <w:rPr>
                 <w:rFonts w:ascii="Calibri" w:cs="Calibri" w:eastAsia="Calibri" w:hAnsi="Calibri"/>
-                <w:i/>
-                <w:iCs/>
-                <w:color w:val="C00000"/>
-                <w:sz w:val="21"/>
-                <w:szCs w:val="21"/>
-              </w:rPr>
-              <w:t xml:space="preserve">[Belangrijkste taak of verantwoordelijkheid]</w:t>
+                <w:color w:val="262626"/>
+                <w:sz w:val="21"/>
+                <w:szCs w:val="21"/>
+              </w:rPr>
+              <w:t xml:space="preserve">Potentiële klanten benaderd om producten te promoten en te verkopen; maandelijkse verkoopdoelen behaald.</w:t>
+            </w:r>
+          </w:p>
+          <w:p>
+            <w:pPr>
+              <w:pStyle w:val="ListParagraph"/>
+              <w:numPr>
+                <w:ilvl w:val="0"/>
+                <w:numId w:val="3"/>
+              </w:numPr>
+              <w:spacing w:after="50" w:line="264"/>
+            </w:pPr>
+            <w:r>
+              <w:rPr>
+                <w:rFonts w:ascii="Calibri" w:cs="Calibri" w:eastAsia="Calibri" w:hAnsi="Calibri"/>
+                <w:color w:val="262626"/>
+                <w:sz w:val="21"/>
+                <w:szCs w:val="21"/>
+              </w:rPr>
+              <w:t xml:space="preserve">Sterke klantrelaties opgebouwd door goede service, met terugkerende klanten als resultaat.</w:t>
+            </w:r>
+          </w:p>
+          <w:p>
+            <w:pPr>
+              <w:pStyle w:val="ListParagraph"/>
+              <w:numPr>
+                <w:ilvl w:val="0"/>
+                <w:numId w:val="3"/>
+              </w:numPr>
+              <w:spacing w:after="50" w:line="264"/>
+            </w:pPr>
+            <w:r>
+              <w:rPr>
+                <w:rFonts w:ascii="Calibri" w:cs="Calibri" w:eastAsia="Calibri" w:hAnsi="Calibri"/>
+                <w:color w:val="262626"/>
+                <w:sz w:val="21"/>
+                <w:szCs w:val="21"/>
+              </w:rPr>
+              <w:t xml:space="preserve">Nauw samengewerkt met het marketingteam om verkoop en campagnes op elkaar af te stemmen.</w:t>
             </w:r>
           </w:p>
           <w:p>
@@ -1222,188 +1224,6 @@
                 <w:sz w:val="23"/>
                 <w:szCs w:val="23"/>
               </w:rPr>
-              <w:t xml:space="preserve">OPLEIDING</w:t>
-            </w:r>
-          </w:p>
-          <w:p>
-            <w:pPr>
-              <w:tabs>
-                <w:tab w:val="right" w:pos="6666"/>
-              </w:tabs>
-              <w:spacing w:after="20" w:before="180"/>
-            </w:pPr>
-            <w:r>
-              <w:rPr>
-                <w:rFonts w:ascii="Calibri" w:cs="Calibri" w:eastAsia="Calibri" w:hAnsi="Calibri"/>
-                <w:i/>
-                <w:iCs/>
-                <w:color w:val="C00000"/>
-                <w:sz w:val="21"/>
-                <w:szCs w:val="21"/>
-              </w:rPr>
-              <w:t xml:space="preserve">[Opleiding en richting]</w:t>
-            </w:r>
-            <w:r>
-              <w:tab/>
-            </w:r>
-            <w:r>
-              <w:rPr>
-                <w:rFonts w:ascii="Calibri" w:cs="Calibri" w:eastAsia="Calibri" w:hAnsi="Calibri"/>
-                <w:i/>
-                <w:iCs/>
-                <w:color w:val="C00000"/>
-                <w:sz w:val="21"/>
-                <w:szCs w:val="21"/>
-              </w:rPr>
-              <w:t xml:space="preserve">[jaar]</w:t>
-            </w:r>
-            <w:r>
-              <w:rPr>
-                <w:rFonts w:ascii="Calibri" w:cs="Calibri" w:eastAsia="Calibri" w:hAnsi="Calibri"/>
-                <w:color w:val="595959"/>
-                <w:sz w:val="20"/>
-                <w:szCs w:val="20"/>
-              </w:rPr>
-              <w:t xml:space="preserve"> – </w:t>
-            </w:r>
-            <w:r>
-              <w:rPr>
-                <w:rFonts w:ascii="Calibri" w:cs="Calibri" w:eastAsia="Calibri" w:hAnsi="Calibri"/>
-                <w:i/>
-                <w:iCs/>
-                <w:color w:val="C00000"/>
-                <w:sz w:val="21"/>
-                <w:szCs w:val="21"/>
-              </w:rPr>
-              <w:t xml:space="preserve">[jaar]</w:t>
-            </w:r>
-          </w:p>
-          <w:p>
-            <w:pPr>
-              <w:spacing w:after="60"/>
-            </w:pPr>
-            <w:r>
-              <w:rPr>
-                <w:rFonts w:ascii="Calibri" w:cs="Calibri" w:eastAsia="Calibri" w:hAnsi="Calibri"/>
-                <w:i/>
-                <w:iCs/>
-                <w:color w:val="C00000"/>
-                <w:sz w:val="21"/>
-                <w:szCs w:val="21"/>
-              </w:rPr>
-              <w:t xml:space="preserve">[Onderwijsinstelling]</w:t>
-            </w:r>
-            <w:r>
-              <w:rPr>
-                <w:rFonts w:ascii="Calibri" w:cs="Calibri" w:eastAsia="Calibri" w:hAnsi="Calibri"/>
-                <w:i/>
-                <w:iCs/>
-                <w:color w:val="595959"/>
-                <w:sz w:val="20"/>
-                <w:szCs w:val="20"/>
-              </w:rPr>
-              <w:t xml:space="preserve">  ·  </w:t>
-            </w:r>
-            <w:r>
-              <w:rPr>
-                <w:rFonts w:ascii="Calibri" w:cs="Calibri" w:eastAsia="Calibri" w:hAnsi="Calibri"/>
-                <w:i/>
-                <w:iCs/>
-                <w:color w:val="C00000"/>
-                <w:sz w:val="21"/>
-                <w:szCs w:val="21"/>
-              </w:rPr>
-              <w:t xml:space="preserve">[Plaats]</w:t>
-            </w:r>
-            <w:r>
-              <w:rPr>
-                <w:rFonts w:ascii="Calibri" w:cs="Calibri" w:eastAsia="Calibri" w:hAnsi="Calibri"/>
-                <w:i/>
-                <w:iCs/>
-                <w:color w:val="595959"/>
-                <w:sz w:val="20"/>
-                <w:szCs w:val="20"/>
-              </w:rPr>
-              <w:t xml:space="preserve">  ·  </w:t>
-            </w:r>
-            <w:r>
-              <w:rPr>
-                <w:rFonts w:ascii="Calibri" w:cs="Calibri" w:eastAsia="Calibri" w:hAnsi="Calibri"/>
-                <w:i/>
-                <w:iCs/>
-                <w:color w:val="C00000"/>
-                <w:sz w:val="21"/>
-                <w:szCs w:val="21"/>
-              </w:rPr>
-              <w:t xml:space="preserve">[diploma behaald]</w:t>
-            </w:r>
-          </w:p>
-          <w:p>
-            <w:pPr>
-              <w:tabs>
-                <w:tab w:val="right" w:pos="6666"/>
-              </w:tabs>
-              <w:spacing w:after="20" w:before="180"/>
-            </w:pPr>
-            <w:r>
-              <w:rPr>
-                <w:rFonts w:ascii="Calibri" w:cs="Calibri" w:eastAsia="Calibri" w:hAnsi="Calibri"/>
-                <w:i/>
-                <w:iCs/>
-                <w:color w:val="C00000"/>
-                <w:sz w:val="21"/>
-                <w:szCs w:val="21"/>
-              </w:rPr>
-              <w:t xml:space="preserve">[Cursus of certificaat]</w:t>
-            </w:r>
-            <w:r>
-              <w:tab/>
-            </w:r>
-            <w:r>
-              <w:rPr>
-                <w:rFonts w:ascii="Calibri" w:cs="Calibri" w:eastAsia="Calibri" w:hAnsi="Calibri"/>
-                <w:i/>
-                <w:iCs/>
-                <w:color w:val="C00000"/>
-                <w:sz w:val="21"/>
-                <w:szCs w:val="21"/>
-              </w:rPr>
-              <w:t xml:space="preserve">[jaar]</w:t>
-            </w:r>
-          </w:p>
-          <w:p>
-            <w:pPr>
-              <w:spacing w:after="60"/>
-            </w:pPr>
-            <w:r>
-              <w:rPr>
-                <w:rFonts w:ascii="Calibri" w:cs="Calibri" w:eastAsia="Calibri" w:hAnsi="Calibri"/>
-                <w:i/>
-                <w:iCs/>
-                <w:color w:val="C00000"/>
-                <w:sz w:val="21"/>
-                <w:szCs w:val="21"/>
-              </w:rPr>
-              <w:t xml:space="preserve">[Aanbieder]</w:t>
-            </w:r>
-          </w:p>
-          <w:p>
-            <w:pPr>
-              <w:pBdr>
-                <w:bottom w:val="single" w:color="1F4E79" w:sz="8" w:space="2"/>
-              </w:pBdr>
-              <w:spacing w:after="120" w:before="300"/>
-            </w:pPr>
-            <w:r>
-              <w:rPr>
-                <w:rFonts w:ascii="Calibri" w:cs="Calibri" w:eastAsia="Calibri" w:hAnsi="Calibri"/>
-                <w:b/>
-                <w:bCs/>
-                <w:color w:val="1F4E79"/>
-                <w:spacing w:val="25"/>
-                <w:sz w:val="23"/>
-                <w:szCs w:val="23"/>
-              </w:rPr>
               <w:t xml:space="preserve">KERNKWALITEITEN</w:t>
             </w:r>
           </w:p>
@@ -1485,7 +1305,37 @@
                 <w:sz w:val="21"/>
                 <w:szCs w:val="21"/>
               </w:rPr>
-              <w:t xml:space="preserve">Praktisch en leergierig: </w:t>
+              <w:t xml:space="preserve">Flexibel: </w:t>
+            </w:r>
+            <w:r>
+              <w:rPr>
+                <w:rFonts w:ascii="Calibri" w:cs="Calibri" w:eastAsia="Calibri" w:hAnsi="Calibri"/>
+                <w:color w:val="262626"/>
+                <w:sz w:val="21"/>
+                <w:szCs w:val="21"/>
+              </w:rPr>
+              <w:t xml:space="preserve">bewezen in uiteenlopende rollen, van sales en klantenservice tot logistiek.</w:t>
+            </w:r>
+          </w:p>
+          <w:p>
+            <w:pPr>
+              <w:pStyle w:val="ListParagraph"/>
+              <w:numPr>
+                <w:ilvl w:val="0"/>
+                <w:numId w:val="3"/>
+              </w:numPr>
+              <w:spacing w:after="50" w:line="264"/>
+            </w:pPr>
+            <w:r>
+              <w:rPr>
+                <w:rFonts w:ascii="Calibri" w:cs="Calibri" w:eastAsia="Calibri" w:hAnsi="Calibri"/>
+                <w:b/>
+                <w:bCs/>
+                <w:color w:val="262626"/>
+                <w:sz w:val="21"/>
+                <w:szCs w:val="21"/>
+              </w:rPr>
+              <w:t xml:space="preserve">Leergierig: </w:t>
             </w:r>
             <w:r>
               <w:rPr>
@@ -1495,36 +1345,6 @@
                 <w:szCs w:val="21"/>
               </w:rPr>
               <w:t xml:space="preserve">maakt zich nieuwe systemen en tools snel eigen en past ze direct toe.</w:t>
-            </w:r>
-          </w:p>
-          <w:p>
-            <w:pPr>
-              <w:pStyle w:val="ListParagraph"/>
-              <w:numPr>
-                <w:ilvl w:val="0"/>
-                <w:numId w:val="3"/>
-              </w:numPr>
-              <w:spacing w:after="50" w:line="264"/>
-            </w:pPr>
-            <w:r>
-              <w:rPr>
-                <w:rFonts w:ascii="Calibri" w:cs="Calibri" w:eastAsia="Calibri" w:hAnsi="Calibri"/>
-                <w:b/>
-                <w:bCs/>
-                <w:color w:val="262626"/>
-                <w:sz w:val="21"/>
-                <w:szCs w:val="21"/>
-              </w:rPr>
-              <w:t xml:space="preserve">Klantgericht: </w:t>
-            </w:r>
-            <w:r>
-              <w:rPr>
-                <w:rFonts w:ascii="Calibri" w:cs="Calibri" w:eastAsia="Calibri" w:hAnsi="Calibri"/>
-                <w:color w:val="262626"/>
-                <w:sz w:val="21"/>
-                <w:szCs w:val="21"/>
-              </w:rPr>
-              <w:t xml:space="preserve">denkt vanuit de klant en maakt processen eenvoudiger en sneller.</w:t>
             </w:r>
           </w:p>
         </w:tc>

</xml_diff>

<commit_message>
Cv bijwerken met werkervaring van LinkedIn
Mede-oprichter HuurDirect (jan 2026), privéchauffeur Van Dijk Services
(mrt 2026) en logistiek medewerker Monta (jul 2025) toegevoegd;
studieduur Summa College op 2024-2027 gezet.

Co-Authored-By: Claude Fable 5.1 <noreply@anthropic.com>
Claude-Session: https://claude.ai/code/session_018ykMZ2P3WGh7UyoGvnCSVu
</commit_message>
<xml_diff>
--- a/docs/cv/cv-tim-hendriks.docx
+++ b/docs/cv/cv-tim-hendriks.docx
@@ -580,7 +580,7 @@
                 <w:sz w:val="20"/>
                 <w:szCs w:val="20"/>
               </w:rPr>
-              <w:t xml:space="preserve">2024 – heden</w:t>
+              <w:t xml:space="preserve">2024 – 2027 (verwacht)</w:t>
             </w:r>
           </w:p>
           <w:p>
@@ -704,7 +704,7 @@
                 <w:sz w:val="24"/>
                 <w:szCs w:val="24"/>
               </w:rPr>
-              <w:t xml:space="preserve">Ondernemer  ·  Oprichter HuurDirect  ·  Student International Business</w:t>
+              <w:t xml:space="preserve">Mede-oprichter HuurDirect  ·  Student International Business</w:t>
             </w:r>
           </w:p>
           <w:p>
@@ -738,7 +738,7 @@
                 <w:sz w:val="21"/>
                 <w:szCs w:val="21"/>
               </w:rPr>
-              <w:t xml:space="preserve">Ondernemende student International Business en oprichter van HuurDirect, een online verhuurplatform voor professioneel gereedschap, machines en materieel. Ik heb het platform vanaf nul opgebouwd en ben verantwoordelijk voor het complete plaatje: van propositie, merk en website tot het verhuurproces en de klantenservice. Daarnaast heb ik ervaring in sales, klantenservice en logistiek, waardoor ik snel schakel tussen verschillende rollen. Ik werk gestructureerd, stel hoge eisen aan kwaliteit en zet automatisering en AI-tools in om slimmer te werken.</w:t>
+              <w:t xml:space="preserve">Ondernemende student International Business en mede-oprichter van HuurDirect, een online verhuurplatform voor professioneel gereedschap, machines en materieel. Ik heb het platform mee opgebouwd vanaf nul en werk aan het complete plaatje: propositie, merk, website, verhuurproces en klantenservice. Daarnaast heb ik ervaring in sales, klantenservice en logistiek, waardoor ik snel schakel tussen verschillende rollen. Ik werk gestructureerd, stel hoge eisen aan kwaliteit en zet automatisering en AI-tools in om slimmer te werken.</w:t>
             </w:r>
           </w:p>
           <w:p>
@@ -777,7 +777,7 @@
                 <w:sz w:val="22"/>
                 <w:szCs w:val="22"/>
               </w:rPr>
-              <w:t xml:space="preserve">Oprichter en eigenaar — HuurDirect</w:t>
+              <w:t xml:space="preserve">Mede-oprichter — HuurDirect</w:t>
             </w:r>
             <w:r>
               <w:tab/>
@@ -785,22 +785,11 @@
             <w:r>
               <w:rPr>
                 <w:rFonts w:ascii="Calibri" w:cs="Calibri" w:eastAsia="Calibri" w:hAnsi="Calibri"/>
-                <w:i/>
-                <w:iCs/>
-                <w:color w:val="C00000"/>
-                <w:sz w:val="21"/>
-                <w:szCs w:val="21"/>
-              </w:rPr>
-              <w:t xml:space="preserve">[startjaar]</w:t>
-            </w:r>
-            <w:r>
-              <w:rPr>
-                <w:rFonts w:ascii="Calibri" w:cs="Calibri" w:eastAsia="Calibri" w:hAnsi="Calibri"/>
                 <w:color w:val="595959"/>
                 <w:sz w:val="20"/>
                 <w:szCs w:val="20"/>
               </w:rPr>
-              <w:t xml:space="preserve"> – heden</w:t>
+              <w:t xml:space="preserve">jan 2026 – heden</w:t>
             </w:r>
           </w:p>
           <w:p>
@@ -816,7 +805,7 @@
                 <w:sz w:val="20"/>
                 <w:szCs w:val="20"/>
               </w:rPr>
-              <w:t xml:space="preserve">Online verhuurplatform voor gereedschap, machines en materieel  ·  ’s-Hertogenbosch</w:t>
+              <w:t xml:space="preserve">Online verhuurplatform voor gereedschap, machines en materieel  ·  Noord-Brabant  ·  hybride</w:t>
             </w:r>
           </w:p>
           <w:p>
@@ -835,7 +824,7 @@
                 <w:sz w:val="21"/>
                 <w:szCs w:val="21"/>
               </w:rPr>
-              <w:t xml:space="preserve">Het platform vanaf nul opgezet: propositie, assortiment, merkidentiteit en website. De site is live en wordt continu verbeterd.</w:t>
+              <w:t xml:space="preserve">Het platform mee opgezet vanaf nul: propositie, assortiment, merkidentiteit en website. De site is live en wordt continu verbeterd.</w:t>
             </w:r>
           </w:p>
           <w:p>
@@ -854,26 +843,7 @@
                 <w:sz w:val="21"/>
                 <w:szCs w:val="21"/>
               </w:rPr>
-              <w:t xml:space="preserve">Verantwoordelijk voor het volledige verhuurproces: van productselectie en reservering tot bezorging, afhalen en retour.</w:t>
-            </w:r>
-          </w:p>
-          <w:p>
-            <w:pPr>
-              <w:pStyle w:val="ListParagraph"/>
-              <w:numPr>
-                <w:ilvl w:val="0"/>
-                <w:numId w:val="3"/>
-              </w:numPr>
-              <w:spacing w:after="50" w:line="264"/>
-            </w:pPr>
-            <w:r>
-              <w:rPr>
-                <w:rFonts w:ascii="Calibri" w:cs="Calibri" w:eastAsia="Calibri" w:hAnsi="Calibri"/>
-                <w:color w:val="262626"/>
-                <w:sz w:val="21"/>
-                <w:szCs w:val="21"/>
-              </w:rPr>
-              <w:t xml:space="preserve">Klantcontact, offertes en administratie; stuurt op een snelle, transparante en betrouwbare klantervaring.</w:t>
+              <w:t xml:space="preserve">Verantwoordelijk voor het verhuurproces van reservering tot bezorging, afhalen en retour, plus klantcontact en administratie.</w:t>
             </w:r>
           </w:p>
           <w:p>
@@ -930,7 +900,7 @@
                 <w:sz w:val="22"/>
                 <w:szCs w:val="22"/>
               </w:rPr>
-              <w:t xml:space="preserve">Stagiair — Contronics Dry Misting</w:t>
+              <w:t xml:space="preserve">Privéchauffeur — Van Dijk Services</w:t>
             </w:r>
             <w:r>
               <w:tab/>
@@ -942,7 +912,7 @@
                 <w:sz w:val="20"/>
                 <w:szCs w:val="20"/>
               </w:rPr>
-              <w:t xml:space="preserve">sep 2024 – dec 2025</w:t>
+              <w:t xml:space="preserve">mrt 2026 – heden</w:t>
             </w:r>
           </w:p>
           <w:p>
@@ -958,7 +928,7 @@
                 <w:sz w:val="20"/>
                 <w:szCs w:val="20"/>
               </w:rPr>
-              <w:t xml:space="preserve">Innovatieve en duurzame vernevelingstechniek  ·  stage vanuit de opleiding International Business</w:t>
+              <w:t xml:space="preserve">Parttime  ·  ’s-Hertogenbosch</w:t>
             </w:r>
           </w:p>
           <w:p>
@@ -977,26 +947,7 @@
                 <w:sz w:val="21"/>
                 <w:szCs w:val="21"/>
               </w:rPr>
-              <w:t xml:space="preserve">Breed meegedraaid in het bedrijf: dossiers en administratie op orde gebracht en meegedacht over nieuwe ideeën.</w:t>
-            </w:r>
-          </w:p>
-          <w:p>
-            <w:pPr>
-              <w:pStyle w:val="ListParagraph"/>
-              <w:numPr>
-                <w:ilvl w:val="0"/>
-                <w:numId w:val="3"/>
-              </w:numPr>
-              <w:spacing w:after="50" w:line="264"/>
-            </w:pPr>
-            <w:r>
-              <w:rPr>
-                <w:rFonts w:ascii="Calibri" w:cs="Calibri" w:eastAsia="Calibri" w:hAnsi="Calibri"/>
-                <w:color w:val="262626"/>
-                <w:sz w:val="21"/>
-                <w:szCs w:val="21"/>
-              </w:rPr>
-              <w:t xml:space="preserve">Het team geholpen met de voorbereiding van een grote vakbeurs en zo bijgedragen aan de zichtbaarheid van het bedrijf op de beurs.</w:t>
+              <w:t xml:space="preserve">Klanten representatief, discreet en stipt op tijd vervoerd; zelfstandig ritten gepland en uitgevoerd.</w:t>
             </w:r>
           </w:p>
           <w:p>
@@ -1015,7 +966,7 @@
                 <w:sz w:val="22"/>
                 <w:szCs w:val="22"/>
               </w:rPr>
-              <w:t xml:space="preserve">Bezorger — I Love Sushi</w:t>
+              <w:t xml:space="preserve">Logistiek medewerker — Monta</w:t>
             </w:r>
             <w:r>
               <w:tab/>
@@ -1027,7 +978,7 @@
                 <w:sz w:val="20"/>
                 <w:szCs w:val="20"/>
               </w:rPr>
-              <w:t xml:space="preserve">sep 2022 – heden</w:t>
+              <w:t xml:space="preserve">jul 2025 – heden</w:t>
             </w:r>
           </w:p>
           <w:p>
@@ -1043,7 +994,7 @@
                 <w:sz w:val="20"/>
                 <w:szCs w:val="20"/>
               </w:rPr>
-              <w:t xml:space="preserve">’s-Hertogenbosch</w:t>
+              <w:t xml:space="preserve">Parttime  ·  e-commerce fulfilment  ·  Engelen</w:t>
             </w:r>
           </w:p>
           <w:p>
@@ -1062,45 +1013,7 @@
                 <w:sz w:val="21"/>
                 <w:szCs w:val="21"/>
               </w:rPr>
-              <w:t xml:space="preserve">Bestellingen efficiënt en op tijd bezorgd bij klanten in en rond ’s-Hertogenbosch.</w:t>
-            </w:r>
-          </w:p>
-          <w:p>
-            <w:pPr>
-              <w:pStyle w:val="ListParagraph"/>
-              <w:numPr>
-                <w:ilvl w:val="0"/>
-                <w:numId w:val="3"/>
-              </w:numPr>
-              <w:spacing w:after="50" w:line="264"/>
-            </w:pPr>
-            <w:r>
-              <w:rPr>
-                <w:rFonts w:ascii="Calibri" w:cs="Calibri" w:eastAsia="Calibri" w:hAnsi="Calibri"/>
-                <w:color w:val="262626"/>
-                <w:sz w:val="21"/>
-                <w:szCs w:val="21"/>
-              </w:rPr>
-              <w:t xml:space="preserve">Hoge klanttevredenheid door bestellingen correct en in goede staat af te leveren.</w:t>
-            </w:r>
-          </w:p>
-          <w:p>
-            <w:pPr>
-              <w:pStyle w:val="ListParagraph"/>
-              <w:numPr>
-                <w:ilvl w:val="0"/>
-                <w:numId w:val="3"/>
-              </w:numPr>
-              <w:spacing w:after="50" w:line="264"/>
-            </w:pPr>
-            <w:r>
-              <w:rPr>
-                <w:rFonts w:ascii="Calibri" w:cs="Calibri" w:eastAsia="Calibri" w:hAnsi="Calibri"/>
-                <w:color w:val="262626"/>
-                <w:sz w:val="21"/>
-                <w:szCs w:val="21"/>
-              </w:rPr>
-              <w:t xml:space="preserve">Routes zelf gepland om de bezorgtijd te verkorten en meer ritten per dienst te halen.</w:t>
+              <w:t xml:space="preserve">Orders verzamelen, inpakken en verzendklaar maken; nauwkeurig werken en tempo houden in piekperiodes.</w:t>
             </w:r>
           </w:p>
           <w:p>
@@ -1119,7 +1032,7 @@
                 <w:sz w:val="22"/>
                 <w:szCs w:val="22"/>
               </w:rPr>
-              <w:t xml:space="preserve">Sales Representative — Face to Face</w:t>
+              <w:t xml:space="preserve">Stagiair — Contronics Dry Misting</w:t>
             </w:r>
             <w:r>
               <w:tab/>
@@ -1131,7 +1044,7 @@
                 <w:sz w:val="20"/>
                 <w:szCs w:val="20"/>
               </w:rPr>
-              <w:t xml:space="preserve">jul 2021 – aug 2022</w:t>
+              <w:t xml:space="preserve">sep 2024 – dec 2025</w:t>
             </w:r>
           </w:p>
           <w:p>
@@ -1147,6 +1060,83 @@
                 <w:sz w:val="20"/>
                 <w:szCs w:val="20"/>
               </w:rPr>
+              <w:t xml:space="preserve">Stage vanuit de opleiding International Business  ·  duurzame vernevelingstechniek</w:t>
+            </w:r>
+          </w:p>
+          <w:p>
+            <w:pPr>
+              <w:pStyle w:val="ListParagraph"/>
+              <w:numPr>
+                <w:ilvl w:val="0"/>
+                <w:numId w:val="3"/>
+              </w:numPr>
+              <w:spacing w:after="50" w:line="264"/>
+            </w:pPr>
+            <w:r>
+              <w:rPr>
+                <w:rFonts w:ascii="Calibri" w:cs="Calibri" w:eastAsia="Calibri" w:hAnsi="Calibri"/>
+                <w:color w:val="262626"/>
+                <w:sz w:val="21"/>
+                <w:szCs w:val="21"/>
+              </w:rPr>
+              <w:t xml:space="preserve">Breed meegedraaid: dossiers en administratie op orde gebracht, meegedacht over nieuwe ideeën en het team geholpen met de voorbereiding van een grote vakbeurs.</w:t>
+            </w:r>
+          </w:p>
+          <w:p>
+            <w:pPr>
+              <w:tabs>
+                <w:tab w:val="right" w:pos="6666"/>
+              </w:tabs>
+              <w:spacing w:after="20" w:before="180"/>
+            </w:pPr>
+            <w:r>
+              <w:rPr>
+                <w:rFonts w:ascii="Calibri" w:cs="Calibri" w:eastAsia="Calibri" w:hAnsi="Calibri"/>
+                <w:b/>
+                <w:bCs/>
+                <w:color w:val="262626"/>
+                <w:sz w:val="22"/>
+                <w:szCs w:val="22"/>
+              </w:rPr>
+              <w:t xml:space="preserve">Bezorger — I Love Sushi</w:t>
+            </w:r>
+            <w:r>
+              <w:tab/>
+            </w:r>
+            <w:r>
+              <w:rPr>
+                <w:rFonts w:ascii="Calibri" w:cs="Calibri" w:eastAsia="Calibri" w:hAnsi="Calibri"/>
+                <w:color w:val="595959"/>
+                <w:sz w:val="20"/>
+                <w:szCs w:val="20"/>
+              </w:rPr>
+              <w:t xml:space="preserve">sep 2022 – </w:t>
+            </w:r>
+            <w:r>
+              <w:rPr>
+                <w:rFonts w:ascii="Calibri" w:cs="Calibri" w:eastAsia="Calibri" w:hAnsi="Calibri"/>
+                <w:i/>
+                <w:iCs/>
+                <w:color w:val="C00000"/>
+                <w:sz w:val="21"/>
+                <w:szCs w:val="21"/>
+              </w:rPr>
+              <w:t xml:space="preserve">[einddatum]</w:t>
+            </w:r>
+          </w:p>
+          <w:p>
+            <w:pPr>
+              <w:spacing w:after="60"/>
+            </w:pPr>
+            <w:r>
+              <w:rPr>
+                <w:rFonts w:ascii="Calibri" w:cs="Calibri" w:eastAsia="Calibri" w:hAnsi="Calibri"/>
+                <w:i/>
+                <w:iCs/>
+                <w:color w:val="595959"/>
+                <w:sz w:val="20"/>
+                <w:szCs w:val="20"/>
+              </w:rPr>
               <w:t xml:space="preserve">’s-Hertogenbosch</w:t>
             </w:r>
           </w:p>
@@ -1166,7 +1156,54 @@
                 <w:sz w:val="21"/>
                 <w:szCs w:val="21"/>
               </w:rPr>
-              <w:t xml:space="preserve">Potentiële klanten benaderd om producten te promoten en te verkopen; maandelijkse verkoopdoelen behaald.</w:t>
+              <w:t xml:space="preserve">Bestellingen efficiënt en op tijd bezorgd; routes zelf gepland en hoge klanttevredenheid door correcte levering.</w:t>
+            </w:r>
+          </w:p>
+          <w:p>
+            <w:pPr>
+              <w:tabs>
+                <w:tab w:val="right" w:pos="6666"/>
+              </w:tabs>
+              <w:spacing w:after="20" w:before="180"/>
+            </w:pPr>
+            <w:r>
+              <w:rPr>
+                <w:rFonts w:ascii="Calibri" w:cs="Calibri" w:eastAsia="Calibri" w:hAnsi="Calibri"/>
+                <w:b/>
+                <w:bCs/>
+                <w:color w:val="262626"/>
+                <w:sz w:val="22"/>
+                <w:szCs w:val="22"/>
+              </w:rPr>
+              <w:t xml:space="preserve">Sales Representative — Face to Face</w:t>
+            </w:r>
+            <w:r>
+              <w:tab/>
+            </w:r>
+            <w:r>
+              <w:rPr>
+                <w:rFonts w:ascii="Calibri" w:cs="Calibri" w:eastAsia="Calibri" w:hAnsi="Calibri"/>
+                <w:color w:val="595959"/>
+                <w:sz w:val="20"/>
+                <w:szCs w:val="20"/>
+              </w:rPr>
+              <w:t xml:space="preserve">jul 2021 – aug 2022</w:t>
+            </w:r>
+          </w:p>
+          <w:p>
+            <w:pPr>
+              <w:spacing w:after="60"/>
+            </w:pPr>
+            <w:r>
+              <w:rPr>
+                <w:rFonts w:ascii="Calibri" w:cs="Calibri" w:eastAsia="Calibri" w:hAnsi="Calibri"/>
+                <w:i/>
+                <w:iCs/>
+                <w:color w:val="595959"/>
+                <w:sz w:val="20"/>
+                <w:szCs w:val="20"/>
+              </w:rPr>
+              <w:t xml:space="preserve">’s-Hertogenbosch</w:t>
             </w:r>
           </w:p>
           <w:p>
@@ -1185,7 +1222,7 @@
                 <w:sz w:val="21"/>
                 <w:szCs w:val="21"/>
               </w:rPr>
-              <w:t xml:space="preserve">Sterke klantrelaties opgebouwd door goede service, met terugkerende klanten als resultaat.</w:t>
+              <w:t xml:space="preserve">Klanten benaderd om producten te promoten en te verkopen; maandelijkse verkoopdoelen behaald en terugkerende klanten opgebouwd.</w:t>
             </w:r>
           </w:p>
           <w:p>
@@ -1275,36 +1312,6 @@
                 <w:sz w:val="21"/>
                 <w:szCs w:val="21"/>
               </w:rPr>
-              <w:t xml:space="preserve">Kwaliteitsgericht: </w:t>
-            </w:r>
-            <w:r>
-              <w:rPr>
-                <w:rFonts w:ascii="Calibri" w:cs="Calibri" w:eastAsia="Calibri" w:hAnsi="Calibri"/>
-                <w:color w:val="262626"/>
-                <w:sz w:val="21"/>
-                <w:szCs w:val="21"/>
-              </w:rPr>
-              <w:t xml:space="preserve">blijft verbeteren tot iets echt goed werkt voor de klant.</w:t>
-            </w:r>
-          </w:p>
-          <w:p>
-            <w:pPr>
-              <w:pStyle w:val="ListParagraph"/>
-              <w:numPr>
-                <w:ilvl w:val="0"/>
-                <w:numId w:val="3"/>
-              </w:numPr>
-              <w:spacing w:after="50" w:line="264"/>
-            </w:pPr>
-            <w:r>
-              <w:rPr>
-                <w:rFonts w:ascii="Calibri" w:cs="Calibri" w:eastAsia="Calibri" w:hAnsi="Calibri"/>
-                <w:b/>
-                <w:bCs/>
-                <w:color w:val="262626"/>
-                <w:sz w:val="21"/>
-                <w:szCs w:val="21"/>
-              </w:rPr>
               <w:t xml:space="preserve">Flexibel: </w:t>
             </w:r>
             <w:r>
@@ -1314,7 +1321,7 @@
                 <w:sz w:val="21"/>
                 <w:szCs w:val="21"/>
               </w:rPr>
-              <w:t xml:space="preserve">bewezen in uiteenlopende rollen, van sales en klantenservice tot logistiek.</w:t>
+              <w:t xml:space="preserve">bewezen in uiteenlopende rollen, van sales en klantenservice tot logistiek en ondernemen.</w:t>
             </w:r>
           </w:p>
           <w:p>

</xml_diff>